<commit_message>
V1.1: Add standalone 1-bit FIFO IP (pal_fifo_bool, DEPTH=600000)
New files:
  tv/fifo/pal_fifo_bool.vhd      - 1-bit Boolean FIFO, depth 600000 entries
  tv/fifo/tb_pal_fifo_bool.vhd   - 7-phase self-checking testbench

FIFO interface:
  Inputs : wr_en, wr_data, rd_en, clk, rst
  Outputs: full, wr_ack, rd_data, empty, rd_valid, level(20), almost_full/empty
  Generics: DEPTH=600000, AF_THRESH=4, AE_THRESH=4

BRAM: ram_style=block -> 19 BRAM36 tiles (18% of cRIO-9056 budget)
Not connected to BRAM display path (fully standalone)

Testbench phases all PASS @3215ns:
  Ph1 write + level check
  Ph2 FIFO-order readback
  Ph3 full flag + overflow rejection
  Ph4 empty flag + underflow rejection
  Ph5 simultaneous rd+wr count stability
  Ph6 reset during operation
  Ph7 pointer wrap-around

Docs updated (FR-019, ICD §6, TM row, CL V1.1, CODE_WALKTHROUGH §8)

https://claude.ai/code/session_017hYU7zmWoUoe7kPyUjvHZ6
</commit_message>
<xml_diff>
--- a/docs/CL_Change_Log.docx
+++ b/docs/CL_Change_Log.docx
@@ -636,6 +636,68 @@
                 <w:sz w:val="19"/>
               </w:rPr>
               <w:t>BRAM double-buffering, full formal docs set (ICD, SRS, SDD, SDP, CM, STP, STR, VC, TM, BR, CL)</w:t>
+            </w:r>
+          </w:p>
+        </w:tc>
+      </w:tr>
+      <w:tr>
+        <w:tc>
+          <w:tcPr>
+            <w:tcW w:type="dxa" w:w="1152"/>
+            <w:shd w:val="clear" w:color="auto" w:fill="FFFFFF"/>
+          </w:tcPr>
+          <w:p>
+            <w:pPr>
+              <w:jc w:val="left"/>
+            </w:pPr>
+            <w:r>
+              <w:rPr>
+                <w:b w:val="0"/>
+                <w:i w:val="0"/>
+                <w:color w:val="000000"/>
+                <w:sz w:val="19"/>
+              </w:rPr>
+              <w:t>V1.1</w:t>
+            </w:r>
+          </w:p>
+        </w:tc>
+        <w:tc>
+          <w:tcPr>
+            <w:tcW w:type="dxa" w:w="1440"/>
+            <w:shd w:val="clear" w:color="auto" w:fill="FFFFFF"/>
+          </w:tcPr>
+          <w:p>
+            <w:pPr>
+              <w:jc w:val="left"/>
+            </w:pPr>
+            <w:r>
+              <w:rPr>
+                <w:b w:val="0"/>
+                <w:i w:val="0"/>
+                <w:color w:val="000000"/>
+                <w:sz w:val="19"/>
+              </w:rPr>
+              <w:t>2026-05-24</w:t>
+            </w:r>
+          </w:p>
+        </w:tc>
+        <w:tc>
+          <w:tcPr>
+            <w:tcW w:type="dxa" w:w="7920"/>
+            <w:shd w:val="clear" w:color="auto" w:fill="FFFFFF"/>
+          </w:tcPr>
+          <w:p>
+            <w:pPr>
+              <w:jc w:val="left"/>
+            </w:pPr>
+            <w:r>
+              <w:rPr>
+                <w:b w:val="0"/>
+                <w:i w:val="0"/>
+                <w:color w:val="000000"/>
+                <w:sz w:val="19"/>
+              </w:rPr>
+              <w:t>Standalone 1-bit FIFO IP (pal_fifo_bool, DEPTH=600000). 7-phase testbench. All docs updated.</w:t>
             </w:r>
           </w:p>
         </w:tc>
@@ -1551,6 +1613,104 @@
         <w:tc>
           <w:tcPr>
             <w:tcW w:type="dxa" w:w="864"/>
+            <w:shd w:val="clear" w:color="auto" w:fill="1F497D"/>
+          </w:tcPr>
+          <w:p>
+            <w:pPr>
+              <w:jc w:val="left"/>
+            </w:pPr>
+            <w:r>
+              <w:rPr>
+                <w:b/>
+                <w:i w:val="0"/>
+                <w:color w:val="FFFFFF"/>
+                <w:sz w:val="20"/>
+              </w:rPr>
+              <w:t>V1.1</w:t>
+            </w:r>
+          </w:p>
+        </w:tc>
+        <w:tc>
+          <w:tcPr>
+            <w:tcW w:type="dxa" w:w="1296"/>
+            <w:shd w:val="clear" w:color="auto" w:fill="1F497D"/>
+          </w:tcPr>
+          <w:p>
+            <w:pPr>
+              <w:jc w:val="left"/>
+            </w:pPr>
+            <w:r>
+              <w:rPr>
+                <w:b w:val="0"/>
+                <w:i w:val="0"/>
+                <w:color w:val="FFFFFF"/>
+                <w:sz w:val="19"/>
+              </w:rPr>
+              <w:t>2026-05-24</w:t>
+            </w:r>
+          </w:p>
+        </w:tc>
+        <w:tc>
+          <w:tcPr>
+            <w:tcW w:type="dxa" w:w="2592"/>
+            <w:shd w:val="clear" w:color="auto" w:fill="1F497D"/>
+          </w:tcPr>
+          <w:p>
+            <w:pPr>
+              <w:jc w:val="left"/>
+            </w:pPr>
+            <w:r>
+              <w:rPr>
+                <w:b/>
+                <w:i w:val="0"/>
+                <w:color w:val="FFFFFF"/>
+                <w:sz w:val="20"/>
+              </w:rPr>
+              <w:t>[feat] Standalone 1-bit FIFO IP (pal_fifo_bool)</w:t>
+            </w:r>
+          </w:p>
+        </w:tc>
+        <w:tc>
+          <w:tcPr>
+            <w:tcW w:type="dxa" w:w="5760"/>
+            <w:shd w:val="clear" w:color="auto" w:fill="DAE8FC"/>
+          </w:tcPr>
+          <w:p>
+            <w:pPr>
+              <w:jc w:val="left"/>
+            </w:pPr>
+            <w:r>
+              <w:rPr>
+                <w:b w:val="0"/>
+                <w:i w:val="0"/>
+                <w:color w:val="000000"/>
+                <w:sz w:val="17"/>
+              </w:rPr>
+              <w:t>New entity pal_fifo_bool: 1-bit Boolean FIFO, DEPTH=600,000 entries (19 BRAM36 tiles). Circular buffer with wr_ptr/rd_ptr/count. Flags: full, empty, almost_full, almost_empty. Strobes: wr_ack, rd_valid. 20-bit level output. Synchronous reset. Self-checking testbench tb_pal_fifo_bool: 7 phases (write, read, full, empty, simultaneous r/w, reset, wrap-around). ALL PASS. Not connected to BRAM display path.</w:t>
+              <w:br/>
+              <w:t>Files: tv/fifo/pal_fifo_bool.vhd, tv/fifo/tb_pal_fifo_bool.vhd</w:t>
+            </w:r>
+          </w:p>
+        </w:tc>
+      </w:tr>
+    </w:tbl>
+    <w:p/>
+    <w:tbl>
+      <w:tblPr>
+        <w:tblStyle w:val="TableGrid"/>
+        <w:tblW w:type="auto" w:w="0"/>
+        <w:tblLook w:firstColumn="1" w:firstRow="1" w:lastColumn="0" w:lastRow="0" w:noHBand="0" w:noVBand="1" w:val="04A0"/>
+      </w:tblPr>
+      <w:tblGrid>
+        <w:gridCol w:w="2436"/>
+        <w:gridCol w:w="2436"/>
+        <w:gridCol w:w="2436"/>
+        <w:gridCol w:w="2436"/>
+      </w:tblGrid>
+      <w:tr>
+        <w:tc>
+          <w:tcPr>
+            <w:tcW w:type="dxa" w:w="864"/>
             <w:shd w:val="clear" w:color="auto" w:fill="2E74B5"/>
           </w:tcPr>
           <w:p>

</xml_diff>